<commit_message>
update: add reference link
</commit_message>
<xml_diff>
--- a/Docs/SRS.docx
+++ b/Docs/SRS.docx
@@ -50,8 +50,8 @@
         <w:tblLook w:val="04A0" w:firstRow="1" w:lastRow="0" w:firstColumn="1" w:lastColumn="0" w:noHBand="0" w:noVBand="1"/>
       </w:tblPr>
       <w:tblGrid>
-        <w:gridCol w:w="2361"/>
-        <w:gridCol w:w="7935"/>
+        <w:gridCol w:w="2374"/>
+        <w:gridCol w:w="7922"/>
       </w:tblGrid>
       <w:tr>
         <w:trPr>
@@ -215,11 +215,26 @@
             <w:vAlign w:val="center"/>
           </w:tcPr>
           <w:p>
+            <w:hyperlink r:id="rId8" w:history="1">
+              <w:r>
+                <w:rPr>
+                  <w:rStyle w:val="Hyperlink"/>
+                  <w:sz w:val="18"/>
+                </w:rPr>
+                <w:t>https://jessnailsart.com/</w:t>
+              </w:r>
+            </w:hyperlink>
             <w:r>
               <w:rPr>
                 <w:sz w:val="18"/>
               </w:rPr>
-              <w:t>https://jessnailsart.com/products/alien-armor-design-by-jess-team</w:t>
+              <w:t xml:space="preserve">, </w:t>
+            </w:r>
+            <w:r>
+              <w:rPr>
+                <w:sz w:val="18"/>
+              </w:rPr>
+              <w:t>https://donailsart.com/</w:t>
             </w:r>
           </w:p>
         </w:tc>
@@ -3352,13 +3367,8 @@
       <w:r>
         <w:t xml:space="preserve"> </w:t>
       </w:r>
-      <w:proofErr w:type="gramStart"/>
-      <w:r>
-        <w:t>(</w:t>
-      </w:r>
-      <w:proofErr w:type="gramEnd"/>
-      <w:r>
-        <w:t>Phase 2)</w:t>
+      <w:r>
+        <w:t>(Phase 2)</w:t>
       </w:r>
     </w:p>
     <w:p>
@@ -3951,15 +3961,12 @@
         <w:spacing w:after="100" w:line="259" w:lineRule="auto"/>
       </w:pPr>
       <w:r>
-        <w:t>Đ</w:t>
-      </w:r>
-      <w:r>
-        <w:t>ội phát triển nên ưu tiên xây dựng phiên bản đầu tiên có khả năng vận hành thực tế, đồng thời thiết kế kiến trúc đủ linh hoạt để mở rộng sau này. Các phần như nhập liệu 100 sản phẩm, đa ngôn ngữ chi tiết, công thức shipping phức tạp, phân quyền admin nâng cao và hosting/domain cần được xác nhận kỹ để tránh phát sinh vượt phạm vi ban đầu.</w:t>
+        <w:t>Đội phát triển nên ưu tiên xây dựng phiên bản đầu tiên có khả năng vận hành thực tế, đồng thời thiết kế kiến trúc đủ linh hoạt để mở rộng sau này. Các phần như nhập liệu 100 sản phẩm, đa ngôn ngữ chi tiết, công thức shipping phức tạp, phân quyền admin nâng cao và hosting/domain cần được xác nhận kỹ để tránh phát sinh vượt phạm vi ban đầu.</w:t>
       </w:r>
     </w:p>
     <w:sectPr>
-      <w:headerReference w:type="default" r:id="rId8"/>
-      <w:footerReference w:type="default" r:id="rId9"/>
+      <w:headerReference w:type="default" r:id="rId9"/>
+      <w:footerReference w:type="default" r:id="rId10"/>
       <w:pgSz w:w="12240" w:h="15840"/>
       <w:pgMar w:top="1008" w:right="1080" w:bottom="1008" w:left="1080" w:header="720" w:footer="720" w:gutter="0"/>
       <w:cols w:space="720"/>
@@ -15643,6 +15650,29 @@
       </w:tcPr>
     </w:tblStylePr>
   </w:style>
+  <w:style w:type="character" w:styleId="Hyperlink">
+    <w:name w:val="Hyperlink"/>
+    <w:basedOn w:val="DefaultParagraphFont"/>
+    <w:uiPriority w:val="99"/>
+    <w:unhideWhenUsed/>
+    <w:rsid w:val="00411B63"/>
+    <w:rPr>
+      <w:color w:val="0000FF" w:themeColor="hyperlink"/>
+      <w:u w:val="single"/>
+    </w:rPr>
+  </w:style>
+  <w:style w:type="character" w:styleId="UnresolvedMention">
+    <w:name w:val="Unresolved Mention"/>
+    <w:basedOn w:val="DefaultParagraphFont"/>
+    <w:uiPriority w:val="99"/>
+    <w:semiHidden/>
+    <w:unhideWhenUsed/>
+    <w:rsid w:val="00411B63"/>
+    <w:rPr>
+      <w:color w:val="605E5C"/>
+      <w:shd w:val="clear" w:color="auto" w:fill="E1DFDD"/>
+    </w:rPr>
+  </w:style>
 </w:styles>
 </file>
 

</xml_diff>